<commit_message>
Windows & author portraits in corridor, optimized frame asset, author atlas, etc.
</commit_message>
<xml_diff>
--- a/Acquired Assets/Asset Credits.docx
+++ b/Acquired Assets/Asset Credits.docx
@@ -84,15 +84,7 @@
     </w:p>
     <w:p>
       <w:r>
-        <w:t>"</w:t>
-      </w:r>
-      <w:proofErr w:type="gramStart"/>
-      <w:r>
-        <w:t>low</w:t>
-      </w:r>
-      <w:proofErr w:type="gramEnd"/>
-      <w:r>
-        <w:t xml:space="preserve"> poly Ivy" (https://skfb.ly/ovOCP) by </w:t>
+        <w:t xml:space="preserve">"low poly Ivy" (https://skfb.ly/ovOCP) by </w:t>
       </w:r>
       <w:proofErr w:type="spellStart"/>
       <w:r>
@@ -103,6 +95,39 @@
         <w:t xml:space="preserve"> is licensed under Creative Commons Attribution (</w:t>
       </w:r>
       <w:hyperlink r:id="rId8" w:history="1">
+        <w:r>
+          <w:rPr>
+            <w:rStyle w:val="Hyperlink"/>
+          </w:rPr>
+          <w:t>http://creativecommons.org/licenses/by/4.0/</w:t>
+        </w:r>
+      </w:hyperlink>
+      <w:r>
+        <w:t>).</w:t>
+      </w:r>
+    </w:p>
+    <w:p>
+      <w:r>
+        <w:t>"PICTURE FRAME 15*20 dimensions" (</w:t>
+      </w:r>
+      <w:hyperlink r:id="rId9" w:history="1">
+        <w:r>
+          <w:rPr>
+            <w:rStyle w:val="Hyperlink"/>
+          </w:rPr>
+          <w:t>https://skfb.ly/ouyDV</w:t>
+        </w:r>
+      </w:hyperlink>
+      <w:r>
+        <w:t>)</w:t>
+      </w:r>
+      <w:r>
+        <w:t xml:space="preserve"> </w:t>
+      </w:r>
+      <w:r>
+        <w:t>by Fred Drabble is licensed under Creative Commons Attribution (</w:t>
+      </w:r>
+      <w:hyperlink r:id="rId10" w:history="1">
         <w:r>
           <w:rPr>
             <w:rStyle w:val="Hyperlink"/>

</xml_diff>

<commit_message>
Optimized fireplace in scene, all author portraits in scene
</commit_message>
<xml_diff>
--- a/Acquired Assets/Asset Credits.docx
+++ b/Acquired Assets/Asset Credits.docx
@@ -139,7 +139,137 @@
         <w:t>).</w:t>
       </w:r>
     </w:p>
-    <w:p/>
+    <w:p>
+      <w:r>
+        <w:t>"Fireplace scene" (</w:t>
+      </w:r>
+      <w:hyperlink r:id="rId11" w:history="1">
+        <w:r>
+          <w:rPr>
+            <w:rStyle w:val="Hyperlink"/>
+          </w:rPr>
+          <w:t>https://skfb.ly/6S7XZ</w:t>
+        </w:r>
+      </w:hyperlink>
+      <w:r>
+        <w:t>)</w:t>
+      </w:r>
+      <w:r>
+        <w:t xml:space="preserve"> </w:t>
+      </w:r>
+      <w:r>
+        <w:t xml:space="preserve">by </w:t>
+      </w:r>
+      <w:proofErr w:type="spellStart"/>
+      <w:r>
+        <w:t>inboundingbox</w:t>
+      </w:r>
+      <w:proofErr w:type="spellEnd"/>
+      <w:r>
+        <w:t xml:space="preserve"> is licensed under Creative Commons Attribution (</w:t>
+      </w:r>
+      <w:hyperlink r:id="rId12" w:history="1">
+        <w:r>
+          <w:rPr>
+            <w:rStyle w:val="Hyperlink"/>
+          </w:rPr>
+          <w:t>http://creativecommons.org/licenses/by/4.0/</w:t>
+        </w:r>
+      </w:hyperlink>
+      <w:r>
+        <w:t>).</w:t>
+      </w:r>
+    </w:p>
+    <w:p>
+      <w:r>
+        <w:t>"Cozy Reading Nook" (</w:t>
+      </w:r>
+      <w:hyperlink r:id="rId13" w:history="1">
+        <w:r>
+          <w:rPr>
+            <w:rStyle w:val="Hyperlink"/>
+          </w:rPr>
+          <w:t>https://skfb.ly/oNxQY</w:t>
+        </w:r>
+      </w:hyperlink>
+      <w:r>
+        <w:t>)</w:t>
+      </w:r>
+      <w:r>
+        <w:t xml:space="preserve"> </w:t>
+      </w:r>
+      <w:r>
+        <w:t xml:space="preserve">by </w:t>
+      </w:r>
+      <w:proofErr w:type="spellStart"/>
+      <w:r>
+        <w:t>sakislaspas</w:t>
+      </w:r>
+      <w:proofErr w:type="spellEnd"/>
+      <w:r>
+        <w:t xml:space="preserve"> is licensed under Creative Commons Attribution-</w:t>
+      </w:r>
+      <w:proofErr w:type="spellStart"/>
+      <w:r>
+        <w:t>ShareAlike</w:t>
+      </w:r>
+      <w:proofErr w:type="spellEnd"/>
+      <w:r>
+        <w:t xml:space="preserve"> (</w:t>
+      </w:r>
+      <w:hyperlink r:id="rId14" w:history="1">
+        <w:r>
+          <w:rPr>
+            <w:rStyle w:val="Hyperlink"/>
+          </w:rPr>
+          <w:t>http://creativecommons.org/licenses/by-sa/4.0/</w:t>
+        </w:r>
+      </w:hyperlink>
+      <w:r>
+        <w:t>).</w:t>
+      </w:r>
+    </w:p>
+    <w:p>
+      <w:r>
+        <w:t>"Fireplace" (</w:t>
+      </w:r>
+      <w:hyperlink r:id="rId15" w:history="1">
+        <w:r>
+          <w:rPr>
+            <w:rStyle w:val="Hyperlink"/>
+          </w:rPr>
+          <w:t>https://skfb.ly/6ZvwX</w:t>
+        </w:r>
+      </w:hyperlink>
+      <w:r>
+        <w:t>)</w:t>
+      </w:r>
+      <w:r>
+        <w:t xml:space="preserve"> </w:t>
+      </w:r>
+      <w:r>
+        <w:t>by AnnaB</w:t>
+      </w:r>
+      <w:proofErr w:type="spellStart"/>
+      <w:r>
+        <w:t>elle</w:t>
+      </w:r>
+      <w:proofErr w:type="spellEnd"/>
+      <w:r>
+        <w:t xml:space="preserve"> Fibonacci is licensed under Creative Commons Attribution (</w:t>
+      </w:r>
+      <w:hyperlink r:id="rId16" w:history="1">
+        <w:r>
+          <w:rPr>
+            <w:rStyle w:val="Hyperlink"/>
+          </w:rPr>
+          <w:t>http://creativecommons.org/licenses/by/4.0/</w:t>
+        </w:r>
+      </w:hyperlink>
+      <w:r>
+        <w:t>).</w:t>
+      </w:r>
+    </w:p>
     <w:sectPr>
       <w:pgSz w:w="12240" w:h="15840"/>
       <w:pgMar w:top="1440" w:right="1440" w:bottom="1440" w:left="1440" w:header="720" w:footer="720" w:gutter="0"/>

</xml_diff>

<commit_message>
Optimized and added unique bookshelves, tables, etc.
</commit_message>
<xml_diff>
--- a/Acquired Assets/Asset Credits.docx
+++ b/Acquired Assets/Asset Credits.docx
@@ -248,17 +248,150 @@
         <w:t xml:space="preserve"> </w:t>
       </w:r>
       <w:r>
-        <w:t>by AnnaB</w:t>
+        <w:t xml:space="preserve">by </w:t>
       </w:r>
       <w:proofErr w:type="spellStart"/>
       <w:r>
-        <w:t>elle</w:t>
+        <w:t>AnnaBelle</w:t>
       </w:r>
       <w:proofErr w:type="spellEnd"/>
       <w:r>
         <w:t xml:space="preserve"> Fibonacci is licensed under Creative Commons Attribution (</w:t>
       </w:r>
       <w:hyperlink r:id="rId16" w:history="1">
+        <w:r>
+          <w:rPr>
+            <w:rStyle w:val="Hyperlink"/>
+          </w:rPr>
+          <w:t>http://creativecommons.org/licenses/by/4.0/</w:t>
+        </w:r>
+      </w:hyperlink>
+      <w:r>
+        <w:t>).</w:t>
+      </w:r>
+    </w:p>
+    <w:p>
+      <w:r>
+        <w:t xml:space="preserve">"Dusty </w:t>
+      </w:r>
+      <w:proofErr w:type="spellStart"/>
+      <w:r>
+        <w:t>bookshelfs</w:t>
+      </w:r>
+      <w:proofErr w:type="spellEnd"/>
+      <w:r>
+        <w:t>" (</w:t>
+      </w:r>
+      <w:hyperlink r:id="rId17" w:history="1">
+        <w:r>
+          <w:rPr>
+            <w:rStyle w:val="Hyperlink"/>
+          </w:rPr>
+          <w:t>https://skfb.ly/orv9K</w:t>
+        </w:r>
+      </w:hyperlink>
+      <w:r>
+        <w:t>)</w:t>
+      </w:r>
+      <w:r>
+        <w:t xml:space="preserve"> </w:t>
+      </w:r>
+      <w:r>
+        <w:t xml:space="preserve">by </w:t>
+      </w:r>
+      <w:proofErr w:type="spellStart"/>
+      <w:r>
+        <w:t>Meanphrog</w:t>
+      </w:r>
+      <w:proofErr w:type="spellEnd"/>
+      <w:r>
+        <w:t xml:space="preserve"> is licensed under Creative Commons Attribution (</w:t>
+      </w:r>
+      <w:hyperlink r:id="rId18" w:history="1">
+        <w:r>
+          <w:rPr>
+            <w:rStyle w:val="Hyperlink"/>
+          </w:rPr>
+          <w:t>http://creativecommons.org/licenses/by/4.0/</w:t>
+        </w:r>
+      </w:hyperlink>
+      <w:r>
+        <w:t>).</w:t>
+      </w:r>
+    </w:p>
+    <w:p>
+      <w:r>
+        <w:t>"</w:t>
+      </w:r>
+      <w:proofErr w:type="spellStart"/>
+      <w:r>
+        <w:t>DeLux</w:t>
+      </w:r>
+      <w:proofErr w:type="spellEnd"/>
+      <w:r>
+        <w:t xml:space="preserve"> Bookshelf" (</w:t>
+      </w:r>
+      <w:hyperlink r:id="rId19" w:history="1">
+        <w:r>
+          <w:rPr>
+            <w:rStyle w:val="Hyperlink"/>
+          </w:rPr>
+          <w:t>https://skfb.ly/6WYOJ</w:t>
+        </w:r>
+      </w:hyperlink>
+      <w:r>
+        <w:t>)</w:t>
+      </w:r>
+      <w:r>
+        <w:t xml:space="preserve"> </w:t>
+      </w:r>
+      <w:r>
+        <w:t>by Helio</w:t>
+      </w:r>
+      <w:proofErr w:type="spellStart"/>
+      <w:r>
+        <w:t>na</w:t>
+      </w:r>
+      <w:proofErr w:type="spellEnd"/>
+      <w:r>
+        <w:t xml:space="preserve"> is licensed under Creative Commons Attribution (</w:t>
+      </w:r>
+      <w:hyperlink r:id="rId20" w:history="1">
+        <w:r>
+          <w:rPr>
+            <w:rStyle w:val="Hyperlink"/>
+          </w:rPr>
+          <w:t>http://creativecommons.org/licenses/by/4.0/</w:t>
+        </w:r>
+      </w:hyperlink>
+      <w:r>
+        <w:t>).</w:t>
+      </w:r>
+    </w:p>
+    <w:p>
+      <w:r>
+        <w:t>"Circular Wooden Bookshelf" (</w:t>
+      </w:r>
+      <w:hyperlink r:id="rId21" w:history="1">
+        <w:r>
+          <w:rPr>
+            <w:rStyle w:val="Hyperlink"/>
+          </w:rPr>
+          <w:t>https://skfb.ly/orv8K</w:t>
+        </w:r>
+      </w:hyperlink>
+      <w:r>
+        <w:t xml:space="preserve">) by </w:t>
+      </w:r>
+      <w:proofErr w:type="spellStart"/>
+      <w:r>
+        <w:t>FordVFX</w:t>
+      </w:r>
+      <w:proofErr w:type="spellEnd"/>
+      <w:r>
+        <w:t xml:space="preserve"> is licensed under Creative Commons Attribution (</w:t>
+      </w:r>
+      <w:hyperlink r:id="rId22" w:history="1">
         <w:r>
           <w:rPr>
             <w:rStyle w:val="Hyperlink"/>

</xml_diff>

<commit_message>
Romantasy windows, central seating, etc.
</commit_message>
<xml_diff>
--- a/Acquired Assets/Asset Credits.docx
+++ b/Acquired Assets/Asset Credits.docx
@@ -84,7 +84,15 @@
     </w:p>
     <w:p>
       <w:r>
-        <w:t xml:space="preserve">"low poly Ivy" (https://skfb.ly/ovOCP) by </w:t>
+        <w:t>"</w:t>
+      </w:r>
+      <w:proofErr w:type="gramStart"/>
+      <w:r>
+        <w:t>low</w:t>
+      </w:r>
+      <w:proofErr w:type="gramEnd"/>
+      <w:r>
+        <w:t xml:space="preserve"> poly Ivy" (https://skfb.ly/ovOCP) by </w:t>
       </w:r>
       <w:proofErr w:type="spellStart"/>
       <w:r>
@@ -182,58 +190,9 @@
     </w:p>
     <w:p>
       <w:r>
-        <w:t>"Cozy Reading Nook" (</w:t>
+        <w:t>"Fireplace" (</w:t>
       </w:r>
       <w:hyperlink r:id="rId13" w:history="1">
-        <w:r>
-          <w:rPr>
-            <w:rStyle w:val="Hyperlink"/>
-          </w:rPr>
-          <w:t>https://skfb.ly/oNxQY</w:t>
-        </w:r>
-      </w:hyperlink>
-      <w:r>
-        <w:t>)</w:t>
-      </w:r>
-      <w:r>
-        <w:t xml:space="preserve"> </w:t>
-      </w:r>
-      <w:r>
-        <w:t xml:space="preserve">by </w:t>
-      </w:r>
-      <w:proofErr w:type="spellStart"/>
-      <w:r>
-        <w:t>sakislaspas</w:t>
-      </w:r>
-      <w:proofErr w:type="spellEnd"/>
-      <w:r>
-        <w:t xml:space="preserve"> is licensed under Creative Commons Attribution-</w:t>
-      </w:r>
-      <w:proofErr w:type="spellStart"/>
-      <w:r>
-        <w:t>ShareAlike</w:t>
-      </w:r>
-      <w:proofErr w:type="spellEnd"/>
-      <w:r>
-        <w:t xml:space="preserve"> (</w:t>
-      </w:r>
-      <w:hyperlink r:id="rId14" w:history="1">
-        <w:r>
-          <w:rPr>
-            <w:rStyle w:val="Hyperlink"/>
-          </w:rPr>
-          <w:t>http://creativecommons.org/licenses/by-sa/4.0/</w:t>
-        </w:r>
-      </w:hyperlink>
-      <w:r>
-        <w:t>).</w:t>
-      </w:r>
-    </w:p>
-    <w:p>
-      <w:r>
-        <w:t>"Fireplace" (</w:t>
-      </w:r>
-      <w:hyperlink r:id="rId15" w:history="1">
         <w:r>
           <w:rPr>
             <w:rStyle w:val="Hyperlink"/>
@@ -257,6 +216,55 @@
       <w:proofErr w:type="spellEnd"/>
       <w:r>
         <w:t xml:space="preserve"> Fibonacci is licensed under Creative Commons Attribution (</w:t>
+      </w:r>
+      <w:hyperlink r:id="rId14" w:history="1">
+        <w:r>
+          <w:rPr>
+            <w:rStyle w:val="Hyperlink"/>
+          </w:rPr>
+          <w:t>http://creativecommons.org/licenses/by/4.0/</w:t>
+        </w:r>
+      </w:hyperlink>
+      <w:r>
+        <w:t>).</w:t>
+      </w:r>
+    </w:p>
+    <w:p>
+      <w:r>
+        <w:t xml:space="preserve">"Dusty </w:t>
+      </w:r>
+      <w:proofErr w:type="spellStart"/>
+      <w:r>
+        <w:t>bookshelfs</w:t>
+      </w:r>
+      <w:proofErr w:type="spellEnd"/>
+      <w:r>
+        <w:t>" (</w:t>
+      </w:r>
+      <w:hyperlink r:id="rId15" w:history="1">
+        <w:r>
+          <w:rPr>
+            <w:rStyle w:val="Hyperlink"/>
+          </w:rPr>
+          <w:t>https://skfb.ly/orv9K</w:t>
+        </w:r>
+      </w:hyperlink>
+      <w:r>
+        <w:t>)</w:t>
+      </w:r>
+      <w:r>
+        <w:t xml:space="preserve"> </w:t>
+      </w:r>
+      <w:r>
+        <w:t xml:space="preserve">by </w:t>
+      </w:r>
+      <w:proofErr w:type="spellStart"/>
+      <w:r>
+        <w:t>Meanphrog</w:t>
+      </w:r>
+      <w:proofErr w:type="spellEnd"/>
+      <w:r>
+        <w:t xml:space="preserve"> is licensed under Creative Commons Attribution (</w:t>
       </w:r>
       <w:hyperlink r:id="rId16" w:history="1">
         <w:r>
@@ -272,22 +280,22 @@
     </w:p>
     <w:p>
       <w:r>
-        <w:t xml:space="preserve">"Dusty </w:t>
+        <w:t>"</w:t>
       </w:r>
       <w:proofErr w:type="spellStart"/>
       <w:r>
-        <w:t>bookshelfs</w:t>
+        <w:t>DeLux</w:t>
       </w:r>
       <w:proofErr w:type="spellEnd"/>
       <w:r>
-        <w:t>" (</w:t>
+        <w:t xml:space="preserve"> Bookshelf" (</w:t>
       </w:r>
       <w:hyperlink r:id="rId17" w:history="1">
         <w:r>
           <w:rPr>
             <w:rStyle w:val="Hyperlink"/>
           </w:rPr>
-          <w:t>https://skfb.ly/orv9K</w:t>
+          <w:t>https://skfb.ly/6WYOJ</w:t>
         </w:r>
       </w:hyperlink>
       <w:r>
@@ -301,7 +309,7 @@
       </w:r>
       <w:proofErr w:type="spellStart"/>
       <w:r>
-        <w:t>Meanphrog</w:t>
+        <w:t>Heliona</w:t>
       </w:r>
       <w:proofErr w:type="spellEnd"/>
       <w:r>
@@ -321,58 +329,9 @@
     </w:p>
     <w:p>
       <w:r>
-        <w:t>"</w:t>
-      </w:r>
-      <w:proofErr w:type="spellStart"/>
-      <w:r>
-        <w:t>DeLux</w:t>
-      </w:r>
-      <w:proofErr w:type="spellEnd"/>
-      <w:r>
-        <w:t xml:space="preserve"> Bookshelf" (</w:t>
+        <w:t>"Circular Wooden Bookshelf" (</w:t>
       </w:r>
       <w:hyperlink r:id="rId19" w:history="1">
-        <w:r>
-          <w:rPr>
-            <w:rStyle w:val="Hyperlink"/>
-          </w:rPr>
-          <w:t>https://skfb.ly/6WYOJ</w:t>
-        </w:r>
-      </w:hyperlink>
-      <w:r>
-        <w:t>)</w:t>
-      </w:r>
-      <w:r>
-        <w:t xml:space="preserve"> </w:t>
-      </w:r>
-      <w:r>
-        <w:t>by Helio</w:t>
-      </w:r>
-      <w:proofErr w:type="spellStart"/>
-      <w:r>
-        <w:t>na</w:t>
-      </w:r>
-      <w:proofErr w:type="spellEnd"/>
-      <w:r>
-        <w:t xml:space="preserve"> is licensed under Creative Commons Attribution (</w:t>
-      </w:r>
-      <w:hyperlink r:id="rId20" w:history="1">
-        <w:r>
-          <w:rPr>
-            <w:rStyle w:val="Hyperlink"/>
-          </w:rPr>
-          <w:t>http://creativecommons.org/licenses/by/4.0/</w:t>
-        </w:r>
-      </w:hyperlink>
-      <w:r>
-        <w:t>).</w:t>
-      </w:r>
-    </w:p>
-    <w:p>
-      <w:r>
-        <w:t>"Circular Wooden Bookshelf" (</w:t>
-      </w:r>
-      <w:hyperlink r:id="rId21" w:history="1">
         <w:r>
           <w:rPr>
             <w:rStyle w:val="Hyperlink"/>
@@ -391,7 +350,7 @@
       <w:r>
         <w:t xml:space="preserve"> is licensed under Creative Commons Attribution (</w:t>
       </w:r>
-      <w:hyperlink r:id="rId22" w:history="1">
+      <w:hyperlink r:id="rId20" w:history="1">
         <w:r>
           <w:rPr>
             <w:rStyle w:val="Hyperlink"/>

</xml_diff>

<commit_message>
More bookshelves, custom textures, etc.
</commit_message>
<xml_diff>
--- a/Acquired Assets/Asset Credits.docx
+++ b/Acquired Assets/Asset Credits.docx
@@ -3,122 +3,82 @@
 <w:document xmlns:wpc="http://schemas.microsoft.com/office/word/2010/wordprocessingCanvas" xmlns:cx="http://schemas.microsoft.com/office/drawing/2014/chartex" xmlns:cx1="http://schemas.microsoft.com/office/drawing/2015/9/8/chartex" xmlns:cx2="http://schemas.microsoft.com/office/drawing/2015/10/21/chartex" xmlns:cx3="http://schemas.microsoft.com/office/drawing/2016/5/9/chartex" xmlns:cx4="http://schemas.microsoft.com/office/drawing/2016/5/10/chartex" xmlns:cx5="http://schemas.microsoft.com/office/drawing/2016/5/11/chartex" xmlns:cx6="http://schemas.microsoft.com/office/drawing/2016/5/12/chartex" xmlns:cx7="http://schemas.microsoft.com/office/drawing/2016/5/13/chartex" xmlns:cx8="http://schemas.microsoft.com/office/drawing/2016/5/14/chartex" xmlns:mc="http://schemas.openxmlformats.org/markup-compatibility/2006" xmlns:aink="http://schemas.microsoft.com/office/drawing/2016/ink" xmlns:am3d="http://schemas.microsoft.com/office/drawing/2017/model3d" xmlns:o="urn:schemas-microsoft-com:office:office" xmlns:oel="http://schemas.microsoft.com/office/2019/extlst" xmlns:r="http://schemas.openxmlformats.org/officeDocument/2006/relationships" xmlns:m="http://schemas.openxmlformats.org/officeDocument/2006/math" xmlns:v="urn:schemas-microsoft-com:vml" xmlns:wp14="http://schemas.microsoft.com/office/word/2010/wordprocessingDrawing" xmlns:wp="http://schemas.openxmlformats.org/drawingml/2006/wordprocessingDrawing" xmlns:w10="urn:schemas-microsoft-com:office:word" xmlns:w="http://schemas.openxmlformats.org/wordprocessingml/2006/main" xmlns:w14="http://schemas.microsoft.com/office/word/2010/wordml" xmlns:w15="http://schemas.microsoft.com/office/word/2012/wordml" xmlns:w16cex="http://schemas.microsoft.com/office/word/2018/wordml/cex" xmlns:w16cid="http://schemas.microsoft.com/office/word/2016/wordml/cid" xmlns:w16="http://schemas.microsoft.com/office/word/2018/wordml" xmlns:w16du="http://schemas.microsoft.com/office/word/2023/wordml/word16du" xmlns:w16sdtdh="http://schemas.microsoft.com/office/word/2020/wordml/sdtdatahash" xmlns:w16sdtfl="http://schemas.microsoft.com/office/word/2024/wordml/sdtformatlock" xmlns:w16se="http://schemas.microsoft.com/office/word/2015/wordml/symex" xmlns:wpg="http://schemas.microsoft.com/office/word/2010/wordprocessingGroup" xmlns:wpi="http://schemas.microsoft.com/office/word/2010/wordprocessingInk" xmlns:wne="http://schemas.microsoft.com/office/word/2006/wordml" xmlns:wps="http://schemas.microsoft.com/office/word/2010/wordprocessingShape" mc:Ignorable="w14 w15 w16se w16cid w16 w16cex w16sdtdh w16sdtfl w16du wp14">
   <w:body>
     <w:p>
-      <w:r>
-        <w:t xml:space="preserve">"Sofa 4 | 3DX" (https://skfb.ly/oRrut) by </w:t>
+      <w:pPr>
+        <w:jc w:val="center"/>
+        <w:rPr>
+          <w:b/>
+          <w:bCs/>
+        </w:rPr>
+      </w:pPr>
+      <w:r>
+        <w:rPr>
+          <w:b/>
+          <w:bCs/>
+        </w:rPr>
+        <w:t xml:space="preserve">From </w:t>
       </w:r>
       <w:proofErr w:type="spellStart"/>
       <w:r>
-        <w:t>Snowism</w:t>
+        <w:rPr>
+          <w:b/>
+          <w:bCs/>
+        </w:rPr>
+        <w:t>Sketchfab</w:t>
       </w:r>
       <w:proofErr w:type="spellEnd"/>
       <w:r>
-        <w:t xml:space="preserve"> is licensed under Creative Commons Attribution (</w:t>
-      </w:r>
-      <w:hyperlink r:id="rId4" w:history="1">
-        <w:r>
-          <w:rPr>
-            <w:rStyle w:val="Hyperlink"/>
-          </w:rPr>
-          <w:t>http://creativecommons.org/licenses/by/4.0/</w:t>
-        </w:r>
-      </w:hyperlink>
-      <w:r>
-        <w:t>).</w:t>
+        <w:rPr>
+          <w:b/>
+          <w:bCs/>
+        </w:rPr>
+        <w:t>, licensed under Creative Commons Attribution (http://creativecommons.org/licenses/by/4.0/):</w:t>
       </w:r>
     </w:p>
     <w:p>
       <w:r>
-        <w:t>"Old Chair" (https://skfb.ly/6T6VF) by A18K is licensed under Creative Commons Attribution (</w:t>
-      </w:r>
-      <w:hyperlink r:id="rId5" w:history="1">
-        <w:r>
-          <w:rPr>
-            <w:rStyle w:val="Hyperlink"/>
-          </w:rPr>
-          <w:t>http://creativecommons.org/licenses/by/4.0/</w:t>
-        </w:r>
-      </w:hyperlink>
-      <w:r>
-        <w:t>).</w:t>
-      </w:r>
+        <w:t xml:space="preserve">"Sofa 4 | 3DX" (https://skfb.ly/oRrut) by </w:t>
+      </w:r>
+      <w:proofErr w:type="spellStart"/>
+      <w:r>
+        <w:t>Snowism</w:t>
+      </w:r>
+      <w:proofErr w:type="spellEnd"/>
     </w:p>
     <w:p>
       <w:r>
-        <w:t>"Bean Bag Chair" (https://skfb.ly/RQRt) by khanhnguyen1189 is licensed under Creative Commons Attribution (</w:t>
-      </w:r>
-      <w:hyperlink r:id="rId6" w:history="1">
-        <w:r>
-          <w:rPr>
-            <w:rStyle w:val="Hyperlink"/>
-          </w:rPr>
-          <w:t>http://creativecommons.org/licenses/by/4.0/</w:t>
-        </w:r>
-      </w:hyperlink>
-      <w:r>
-        <w:t>).</w:t>
+        <w:t>"Old Chair" (https://skfb.ly/6T6VF) by A18K</w:t>
       </w:r>
     </w:p>
     <w:p>
       <w:r>
-        <w:t xml:space="preserve">"Stained Glass Window" (https://skfb.ly/oGySP) by </w:t>
-      </w:r>
-      <w:proofErr w:type="spellStart"/>
-      <w:r>
-        <w:t>mejack</w:t>
-      </w:r>
-      <w:proofErr w:type="spellEnd"/>
-      <w:r>
-        <w:t xml:space="preserve"> is licensed under Creative Commons Attribution (</w:t>
-      </w:r>
-      <w:hyperlink r:id="rId7" w:history="1">
-        <w:r>
-          <w:rPr>
-            <w:rStyle w:val="Hyperlink"/>
-          </w:rPr>
-          <w:t>http://creativecommons.org/licenses/by/4.0/</w:t>
-        </w:r>
-      </w:hyperlink>
-      <w:r>
-        <w:t>).</w:t>
+        <w:t>"Bean Bag Chair" (https://skfb.ly/RQRt) by khanhnguyen1189</w:t>
       </w:r>
     </w:p>
     <w:p>
       <w:r>
-        <w:t>"</w:t>
-      </w:r>
-      <w:proofErr w:type="gramStart"/>
-      <w:r>
-        <w:t>low</w:t>
-      </w:r>
-      <w:proofErr w:type="gramEnd"/>
-      <w:r>
-        <w:t xml:space="preserve"> poly Ivy" (https://skfb.ly/ovOCP) by </w:t>
+        <w:t xml:space="preserve">"Stained Glass Window" (https://skfb.ly/oGySP) by </w:t>
       </w:r>
       <w:proofErr w:type="spellStart"/>
       <w:r>
-        <w:t>spicybamer</w:t>
+        <w:t>mejack</w:t>
       </w:r>
       <w:proofErr w:type="spellEnd"/>
-      <w:r>
-        <w:t xml:space="preserve"> is licensed under Creative Commons Attribution (</w:t>
-      </w:r>
-      <w:hyperlink r:id="rId8" w:history="1">
-        <w:r>
-          <w:rPr>
-            <w:rStyle w:val="Hyperlink"/>
-          </w:rPr>
-          <w:t>http://creativecommons.org/licenses/by/4.0/</w:t>
-        </w:r>
-      </w:hyperlink>
-      <w:r>
-        <w:t>).</w:t>
-      </w:r>
     </w:p>
     <w:p>
       <w:r>
+        <w:t xml:space="preserve">"low poly Ivy" (https://skfb.ly/ovOCP) by </w:t>
+      </w:r>
+      <w:proofErr w:type="spellStart"/>
+      <w:r>
+        <w:t>spicybamer</w:t>
+      </w:r>
+      <w:proofErr w:type="spellEnd"/>
+    </w:p>
+    <w:p>
+      <w:r>
         <w:t>"PICTURE FRAME 15*20 dimensions" (</w:t>
       </w:r>
-      <w:hyperlink r:id="rId9" w:history="1">
+      <w:hyperlink r:id="rId4" w:history="1">
         <w:r>
           <w:rPr>
             <w:rStyle w:val="Hyperlink"/>
@@ -133,25 +93,14 @@
         <w:t xml:space="preserve"> </w:t>
       </w:r>
       <w:r>
-        <w:t>by Fred Drabble is licensed under Creative Commons Attribution (</w:t>
-      </w:r>
-      <w:hyperlink r:id="rId10" w:history="1">
-        <w:r>
-          <w:rPr>
-            <w:rStyle w:val="Hyperlink"/>
-          </w:rPr>
-          <w:t>http://creativecommons.org/licenses/by/4.0/</w:t>
-        </w:r>
-      </w:hyperlink>
-      <w:r>
-        <w:t>).</w:t>
+        <w:t>by Fred Drabble</w:t>
       </w:r>
     </w:p>
     <w:p>
       <w:r>
         <w:t>"Fireplace scene" (</w:t>
       </w:r>
-      <w:hyperlink r:id="rId11" w:history="1">
+      <w:hyperlink r:id="rId5" w:history="1">
         <w:r>
           <w:rPr>
             <w:rStyle w:val="Hyperlink"/>
@@ -173,26 +122,12 @@
         <w:t>inboundingbox</w:t>
       </w:r>
       <w:proofErr w:type="spellEnd"/>
-      <w:r>
-        <w:t xml:space="preserve"> is licensed under Creative Commons Attribution (</w:t>
-      </w:r>
-      <w:hyperlink r:id="rId12" w:history="1">
-        <w:r>
-          <w:rPr>
-            <w:rStyle w:val="Hyperlink"/>
-          </w:rPr>
-          <w:t>http://creativecommons.org/licenses/by/4.0/</w:t>
-        </w:r>
-      </w:hyperlink>
-      <w:r>
-        <w:t>).</w:t>
-      </w:r>
     </w:p>
     <w:p>
       <w:r>
         <w:t>"Fireplace" (</w:t>
       </w:r>
-      <w:hyperlink r:id="rId13" w:history="1">
+      <w:hyperlink r:id="rId6" w:history="1">
         <w:r>
           <w:rPr>
             <w:rStyle w:val="Hyperlink"/>
@@ -215,18 +150,7 @@
       </w:r>
       <w:proofErr w:type="spellEnd"/>
       <w:r>
-        <w:t xml:space="preserve"> Fibonacci is licensed under Creative Commons Attribution (</w:t>
-      </w:r>
-      <w:hyperlink r:id="rId14" w:history="1">
-        <w:r>
-          <w:rPr>
-            <w:rStyle w:val="Hyperlink"/>
-          </w:rPr>
-          <w:t>http://creativecommons.org/licenses/by/4.0/</w:t>
-        </w:r>
-      </w:hyperlink>
-      <w:r>
-        <w:t>).</w:t>
+        <w:t xml:space="preserve"> Fibonacci</w:t>
       </w:r>
     </w:p>
     <w:p>
@@ -241,7 +165,7 @@
       <w:r>
         <w:t>" (</w:t>
       </w:r>
-      <w:hyperlink r:id="rId15" w:history="1">
+      <w:hyperlink r:id="rId7" w:history="1">
         <w:r>
           <w:rPr>
             <w:rStyle w:val="Hyperlink"/>
@@ -263,20 +187,6 @@
         <w:t>Meanphrog</w:t>
       </w:r>
       <w:proofErr w:type="spellEnd"/>
-      <w:r>
-        <w:t xml:space="preserve"> is licensed under Creative Commons Attribution (</w:t>
-      </w:r>
-      <w:hyperlink r:id="rId16" w:history="1">
-        <w:r>
-          <w:rPr>
-            <w:rStyle w:val="Hyperlink"/>
-          </w:rPr>
-          <w:t>http://creativecommons.org/licenses/by/4.0/</w:t>
-        </w:r>
-      </w:hyperlink>
-      <w:r>
-        <w:t>).</w:t>
-      </w:r>
     </w:p>
     <w:p>
       <w:r>
@@ -290,7 +200,7 @@
       <w:r>
         <w:t xml:space="preserve"> Bookshelf" (</w:t>
       </w:r>
-      <w:hyperlink r:id="rId17" w:history="1">
+      <w:hyperlink r:id="rId8" w:history="1">
         <w:r>
           <w:rPr>
             <w:rStyle w:val="Hyperlink"/>
@@ -312,26 +222,12 @@
         <w:t>Heliona</w:t>
       </w:r>
       <w:proofErr w:type="spellEnd"/>
-      <w:r>
-        <w:t xml:space="preserve"> is licensed under Creative Commons Attribution (</w:t>
-      </w:r>
-      <w:hyperlink r:id="rId18" w:history="1">
-        <w:r>
-          <w:rPr>
-            <w:rStyle w:val="Hyperlink"/>
-          </w:rPr>
-          <w:t>http://creativecommons.org/licenses/by/4.0/</w:t>
-        </w:r>
-      </w:hyperlink>
-      <w:r>
-        <w:t>).</w:t>
-      </w:r>
     </w:p>
     <w:p>
       <w:r>
         <w:t>"Circular Wooden Bookshelf" (</w:t>
       </w:r>
-      <w:hyperlink r:id="rId19" w:history="1">
+      <w:hyperlink r:id="rId9" w:history="1">
         <w:r>
           <w:rPr>
             <w:rStyle w:val="Hyperlink"/>
@@ -347,20 +243,94 @@
         <w:t>FordVFX</w:t>
       </w:r>
       <w:proofErr w:type="spellEnd"/>
-      <w:r>
-        <w:t xml:space="preserve"> is licensed under Creative Commons Attribution (</w:t>
-      </w:r>
-      <w:hyperlink r:id="rId20" w:history="1">
+    </w:p>
+    <w:p>
+      <w:r>
+        <w:t>"Antique wooden bookcase - Game model" (</w:t>
+      </w:r>
+      <w:hyperlink r:id="rId10" w:history="1">
         <w:r>
           <w:rPr>
             <w:rStyle w:val="Hyperlink"/>
           </w:rPr>
-          <w:t>http://creativecommons.org/licenses/by/4.0/</w:t>
+          <w:t>https://skfb.ly/orwXu</w:t>
         </w:r>
       </w:hyperlink>
       <w:r>
-        <w:t>).</w:t>
-      </w:r>
+        <w:t>)</w:t>
+      </w:r>
+      <w:r>
+        <w:t xml:space="preserve"> </w:t>
+      </w:r>
+      <w:r>
+        <w:t>by Lorenzo Drago</w:t>
+      </w:r>
+    </w:p>
+    <w:p/>
+    <w:p>
+      <w:pPr>
+        <w:jc w:val="center"/>
+        <w:rPr>
+          <w:b/>
+          <w:bCs/>
+        </w:rPr>
+      </w:pPr>
+      <w:r>
+        <w:rPr>
+          <w:b/>
+          <w:bCs/>
+        </w:rPr>
+        <w:t xml:space="preserve">From </w:t>
+      </w:r>
+      <w:proofErr w:type="spellStart"/>
+      <w:r>
+        <w:rPr>
+          <w:b/>
+          <w:bCs/>
+        </w:rPr>
+        <w:t>CGTrader</w:t>
+      </w:r>
+      <w:proofErr w:type="spellEnd"/>
+      <w:r>
+        <w:rPr>
+          <w:b/>
+          <w:bCs/>
+        </w:rPr>
+        <w:t>, Royalty Free:</w:t>
+      </w:r>
+    </w:p>
+    <w:p>
+      <w:r>
+        <w:t>“</w:t>
+      </w:r>
+      <w:r>
+        <w:t>Old Magic Bookshelf</w:t>
+      </w:r>
+      <w:r>
+        <w:t>” (</w:t>
+      </w:r>
+      <w:hyperlink r:id="rId11" w:history="1">
+        <w:r>
+          <w:rPr>
+            <w:rStyle w:val="Hyperlink"/>
+          </w:rPr>
+          <w:t>https://www.cgtrader.com/products/old-magic-bookshelf</w:t>
+        </w:r>
+      </w:hyperlink>
+      <w:r>
+        <w:t>)</w:t>
+      </w:r>
+      <w:r>
+        <w:t xml:space="preserve"> </w:t>
+      </w:r>
+      <w:r>
+        <w:t xml:space="preserve">by </w:t>
+      </w:r>
+      <w:proofErr w:type="spellStart"/>
+      <w:r>
+        <w:t>harudevua</w:t>
+      </w:r>
+      <w:proofErr w:type="spellEnd"/>
     </w:p>
     <w:sectPr>
       <w:pgSz w:w="12240" w:h="15840"/>
@@ -1312,6 +1282,18 @@
       <w:shd w:val="clear" w:color="auto" w:fill="E1DFDD"/>
     </w:rPr>
   </w:style>
+  <w:style w:type="character" w:styleId="FollowedHyperlink">
+    <w:name w:val="FollowedHyperlink"/>
+    <w:basedOn w:val="DefaultParagraphFont"/>
+    <w:uiPriority w:val="99"/>
+    <w:semiHidden/>
+    <w:unhideWhenUsed/>
+    <w:rsid w:val="001E5FDE"/>
+    <w:rPr>
+      <w:color w:val="96607D" w:themeColor="followedHyperlink"/>
+      <w:u w:val="single"/>
+    </w:rPr>
+  </w:style>
 </w:styles>
 </file>
 

</xml_diff>

<commit_message>
Romantasy black and gold themed - walls and floor textured (not final - ideating), tables, etc.
</commit_message>
<xml_diff>
--- a/Acquired Assets/Asset Credits.docx
+++ b/Acquired Assets/Asset Credits.docx
@@ -20,42 +20,119 @@
     </w:p>
     <w:p>
       <w:r>
-        <w:t>"Sofa 4 | 3DX" (https://skfb.ly/oRrut) by Snowism</w:t>
+        <w:t>"Sofa 4 | 3DX" (</w:t>
+      </w:r>
+      <w:hyperlink r:id="rId4" w:history="1">
+        <w:r>
+          <w:rPr>
+            <w:rStyle w:val="Hyperlink"/>
+          </w:rPr>
+          <w:t>https://skfb.ly/oRrut</w:t>
+        </w:r>
+      </w:hyperlink>
+      <w:r>
+        <w:t>)</w:t>
+      </w:r>
+      <w:r>
+        <w:t xml:space="preserve"> </w:t>
+      </w:r>
+      <w:r>
+        <w:t>by Snowism</w:t>
       </w:r>
     </w:p>
     <w:p>
       <w:r>
-        <w:t>"Old Chair" (https://skfb.ly/6T6VF) by A18K</w:t>
+        <w:t>"Old Chair" (</w:t>
+      </w:r>
+      <w:hyperlink r:id="rId5" w:history="1">
+        <w:r>
+          <w:rPr>
+            <w:rStyle w:val="Hyperlink"/>
+          </w:rPr>
+          <w:t>https://skfb.ly/6T6VF</w:t>
+        </w:r>
+      </w:hyperlink>
+      <w:r>
+        <w:t>)</w:t>
+      </w:r>
+      <w:r>
+        <w:t xml:space="preserve"> </w:t>
+      </w:r>
+      <w:r>
+        <w:t>by A18K</w:t>
       </w:r>
     </w:p>
     <w:p>
       <w:r>
-        <w:t>"Bean Bag Chair" (https://skfb.ly/RQRt) by khanhnguyen1189</w:t>
+        <w:t>"Bean Bag Chair" (</w:t>
+      </w:r>
+      <w:hyperlink r:id="rId6" w:history="1">
+        <w:r>
+          <w:rPr>
+            <w:rStyle w:val="Hyperlink"/>
+          </w:rPr>
+          <w:t>https://skfb.ly/RQRt</w:t>
+        </w:r>
+      </w:hyperlink>
+      <w:r>
+        <w:t>)</w:t>
+      </w:r>
+      <w:r>
+        <w:t xml:space="preserve"> </w:t>
+      </w:r>
+      <w:r>
+        <w:t>by khanhnguyen1189</w:t>
       </w:r>
     </w:p>
     <w:p>
       <w:r>
-        <w:t>"Stained Glass Window" (https://skfb.ly/oGySP) by mejack</w:t>
+        <w:t>"Stained Glass Window" (</w:t>
+      </w:r>
+      <w:hyperlink r:id="rId7" w:history="1">
+        <w:r>
+          <w:rPr>
+            <w:rStyle w:val="Hyperlink"/>
+          </w:rPr>
+          <w:t>https://skfb.ly/oGySP</w:t>
+        </w:r>
+      </w:hyperlink>
+      <w:r>
+        <w:t>)</w:t>
+      </w:r>
+      <w:r>
+        <w:t xml:space="preserve"> </w:t>
+      </w:r>
+      <w:r>
+        <w:t>by mejack</w:t>
       </w:r>
     </w:p>
     <w:p>
       <w:r>
-        <w:t>"</w:t>
-      </w:r>
-      <w:proofErr w:type="gramStart"/>
-      <w:r>
-        <w:t>low</w:t>
-      </w:r>
-      <w:proofErr w:type="gramEnd"/>
-      <w:r>
-        <w:t xml:space="preserve"> poly Ivy" (https://skfb.ly/ovOCP) by spicybamer</w:t>
+        <w:t>"low poly Ivy" (</w:t>
+      </w:r>
+      <w:hyperlink r:id="rId8" w:history="1">
+        <w:r>
+          <w:rPr>
+            <w:rStyle w:val="Hyperlink"/>
+          </w:rPr>
+          <w:t>https://skfb.ly/ovOCP</w:t>
+        </w:r>
+      </w:hyperlink>
+      <w:r>
+        <w:t>)</w:t>
+      </w:r>
+      <w:r>
+        <w:t xml:space="preserve"> </w:t>
+      </w:r>
+      <w:r>
+        <w:t>by spicybamer</w:t>
       </w:r>
     </w:p>
     <w:p>
       <w:r>
         <w:t>"PICTURE FRAME 15*20 dimensions" (</w:t>
       </w:r>
-      <w:hyperlink r:id="rId4" w:history="1">
+      <w:hyperlink r:id="rId9" w:history="1">
         <w:r>
           <w:rPr>
             <w:rStyle w:val="Hyperlink"/>
@@ -77,7 +154,7 @@
       <w:r>
         <w:t>"Fireplace scene" (</w:t>
       </w:r>
-      <w:hyperlink r:id="rId5" w:history="1">
+      <w:hyperlink r:id="rId10" w:history="1">
         <w:r>
           <w:rPr>
             <w:rStyle w:val="Hyperlink"/>
@@ -99,7 +176,7 @@
       <w:r>
         <w:t>"Fireplace" (</w:t>
       </w:r>
-      <w:hyperlink r:id="rId6" w:history="1">
+      <w:hyperlink r:id="rId11" w:history="1">
         <w:r>
           <w:rPr>
             <w:rStyle w:val="Hyperlink"/>
@@ -121,7 +198,7 @@
       <w:r>
         <w:t>"Dusty bookshelfs" (</w:t>
       </w:r>
-      <w:hyperlink r:id="rId7" w:history="1">
+      <w:hyperlink r:id="rId12" w:history="1">
         <w:r>
           <w:rPr>
             <w:rStyle w:val="Hyperlink"/>
@@ -143,7 +220,7 @@
       <w:r>
         <w:t>"DeLux Bookshelf" (</w:t>
       </w:r>
-      <w:hyperlink r:id="rId8" w:history="1">
+      <w:hyperlink r:id="rId13" w:history="1">
         <w:r>
           <w:rPr>
             <w:rStyle w:val="Hyperlink"/>
@@ -165,7 +242,7 @@
       <w:r>
         <w:t>"Circular Wooden Bookshelf" (</w:t>
       </w:r>
-      <w:hyperlink r:id="rId9" w:history="1">
+      <w:hyperlink r:id="rId14" w:history="1">
         <w:r>
           <w:rPr>
             <w:rStyle w:val="Hyperlink"/>
@@ -181,7 +258,7 @@
       <w:r>
         <w:t>"Antique wooden bookcase - Game model" (</w:t>
       </w:r>
-      <w:hyperlink r:id="rId10" w:history="1">
+      <w:hyperlink r:id="rId15" w:history="1">
         <w:r>
           <w:rPr>
             <w:rStyle w:val="Hyperlink"/>
@@ -197,6 +274,28 @@
       </w:r>
       <w:r>
         <w:t>by Lorenzo Drago</w:t>
+      </w:r>
+    </w:p>
+    <w:p>
+      <w:r>
+        <w:t>"Gothic Table" (</w:t>
+      </w:r>
+      <w:hyperlink r:id="rId16" w:history="1">
+        <w:r>
+          <w:rPr>
+            <w:rStyle w:val="Hyperlink"/>
+          </w:rPr>
+          <w:t>https://skfb.ly/6CE9u</w:t>
+        </w:r>
+      </w:hyperlink>
+      <w:r>
+        <w:t>)</w:t>
+      </w:r>
+      <w:r>
+        <w:t xml:space="preserve"> </w:t>
+      </w:r>
+      <w:r>
+        <w:t>by Dirtrock</w:t>
       </w:r>
     </w:p>
     <w:p/>
@@ -226,7 +325,7 @@
       <w:r>
         <w:t>” (</w:t>
       </w:r>
-      <w:hyperlink r:id="rId11" w:history="1">
+      <w:hyperlink r:id="rId17" w:history="1">
         <w:r>
           <w:rPr>
             <w:rStyle w:val="Hyperlink"/>

</xml_diff>